<commit_message>
Retrieval report: keep only the historic coverage analysis
Remove the relevance / lucky-match / content-judge sections (precision reality-check,
label-vs-content cross-tab, why-lucky-happens) per request. Report is now purely about
how much of a ticket's GT Value Streams the historic search covers: what-happened-to-
each-ticket, VS-per-ticket difficulty, easy-vs-hard coverage, coverage-vs-K (now
coverage-only, diminishing returns), and where the first correct stream ranks. MD +
docx + generator + charts all coverage-only.

Co-Authored-By: Claude Opus 4.8 <noreply@anthropic.com>
</commit_message>
<xml_diff>
--- a/docs/retrieval_report.docx
+++ b/docs/retrieval_report.docx
@@ -7,12 +7,12 @@
         <w:pStyle w:val="Title"/>
       </w:pPr>
       <w:r>
-        <w:t>How good is our “similar past tickets” search?</w:t>
+        <w:t>How much of the answer does our “similar past tickets” search find?</w:t>
       </w:r>
     </w:p>
     <w:p>
       <w:r>
-        <w:t>A plain-language report on the search that finds similar past tickets and shows them to the model as examples. Tested on 373 real tickets. Each chart says what it shows and how to read it; a glossary is at the end.</w:t>
+        <w:t>A plain-language report on the search that finds similar past tickets and shows them to the model. We measure COVERAGE: of a ticket's correct Value Streams, how many does the search surface. Tested on 373 real tickets. Each chart says what it shows and how to read it.</w:t>
       </w:r>
     </w:p>
     <w:p>
@@ -28,7 +28,7 @@
         <w:pStyle w:val="ListBullet"/>
       </w:pPr>
       <w:r>
-        <w:t>The search is GREAT at finding the right examples — the correct Value Stream shows up for 90% of tickets, usually as the very first result.</w:t>
+        <w:t>The search reliably finds the right Value Streams. The correct ones show up for 90% of a typical ticket's streams, and 96% of tickets find at least one.</w:t>
       </w:r>
     </w:p>
     <w:p>
@@ -36,7 +36,7 @@
         <w:pStyle w:val="ListBullet"/>
       </w:pPr>
       <w:r>
-        <w:t>But about HALF of what it calls a “match” only matches by coincidence — two independent checks (ignoring generic tags, and an AI reviewer) both say real relevance is ~33–37%, not the 67% the simple count suggests.</w:t>
+        <w:t>78% of tickets find EVERY one of their correct Value Streams; 18% find some but miss a few; only 4% find none.</w:t>
       </w:r>
     </w:p>
     <w:p>
@@ -44,7 +44,7 @@
         <w:pStyle w:val="ListBullet"/>
       </w:pPr>
       <w:r>
-        <w:t>The cause: 6 generic catch-all tags + a tail of “overloaded” tickets tagged with up to 19 Value Streams that match almost anything.</w:t>
+        <w:t>The misses are concentrated in the HARD tickets (those with several Value Streams) — there we find most streams (88%) but the complete set only 63% of the time.</w:t>
       </w:r>
     </w:p>
     <w:p>
@@ -52,7 +52,7 @@
         <w:pStyle w:val="ListBullet"/>
       </w:pPr>
       <w:r>
-        <w:t>Showing 6 past tickets is the sweet spot — more dilutes the examples without really helping.</w:t>
+        <w:t>Showing 6 past tickets is enough — going to 10 adds only ~4 points of coverage.</w:t>
       </w:r>
     </w:p>
     <w:p>
@@ -60,7 +60,7 @@
         <w:pStyle w:val="ListBullet"/>
       </w:pPr>
       <w:r>
-        <w:t>Fix worth doing: down-weight the generic tags and overloaded tickets when ranking — it sharpens relevance AND helps cover the hard multi-stream tickets.</w:t>
+        <w:t>Bottom line: the search puts the right answers in front of the model — coverage is not the bottleneck.</w:t>
       </w:r>
     </w:p>
     <w:p>
@@ -68,12 +68,17 @@
         <w:pStyle w:val="Heading1"/>
       </w:pPr>
       <w:r>
-        <w:t>1. It finds the right examples</w:t>
+        <w:t>1. What happened to each ticket</w:t>
       </w:r>
     </w:p>
     <w:p>
       <w:r>
-        <w:t>For 90% of tickets the correct Value Stream is among the 6 pulled examples, 96% have at least one genuinely useful example, and for 288 of 373 tickets the FIRST result is already a hit. Finding good examples is not the problem.</w:t>
+        <w:t>When we show the 6 most similar past tickets, every ticket lands in exactly one of three groups (so they add up to 100%): found ALL its correct Value Streams (78%), found SOME but missed a few (18%), or found NONE (4%). So 96% find at least one and 78% find everything.</w:t>
+      </w:r>
+    </w:p>
+    <w:p>
+      <w:r>
+        <w:t>One more number, measured differently: averaged across tickets, a typical ticket has 90% of its correct streams present in the examples. (That 90% is a per-ticket average, not a count of tickets — both say coverage is strong.)</w:t>
       </w:r>
     </w:p>
     <w:p>
@@ -122,7 +127,7 @@
     </w:p>
     <w:p>
       <w:r>
-        <w:t>Half the tickets belong to a single Value Stream (easy — one answer to find); the other half belong to several, a few to as many as 19 (hard). So the coverage numbers are an average across easy and hard tickets.</w:t>
+        <w:t>Each bar is how many of the 373 tickets have that many correct Value Streams. Half (193) have just one — easy, one answer to find. The rest have several, and 28 tickets have 10 or more (a few have 19). The more streams a ticket has, the harder it is to find them all — so the coverage numbers are an average across easy and hard tickets.</w:t>
       </w:r>
     </w:p>
     <w:p>
@@ -171,7 +176,7 @@
     </w:p>
     <w:p>
       <w:r>
-        <w:t>On hard (multi-stream) tickets the search still surfaces 88% of the streams on average — almost as good as the 92% for easy tickets. But getting EVERY stream right happens only 63% of the time (vs 92% for easy). In plain terms: on a hard ticket we catch the obvious streams and usually miss one or two from the long tail.</w:t>
+        <w:t>Two ticket groups (easy = 1 stream, hard = 2+), each measured two ways. BLUE 'found most' is the average fraction of a ticket's streams found — easy 92%, hard 88% (nearly the same, so we find most of the answer even on hard tickets). GREEN 'found every' is how often ALL streams were found — easy 92%, hard only 63%. For easy tickets the two bars match (one stream, so 'most' and 'every' are the same). For hard tickets the gap (88% vs 63%) is the story: we usually catch the obvious streams but miss one or two from the long tail.</w:t>
       </w:r>
     </w:p>
     <w:p>
@@ -215,19 +220,19 @@
         <w:pStyle w:val="Heading1"/>
       </w:pPr>
       <w:r>
-        <w:t>4. But “relevant” is overcounted</w:t>
+        <w:t>4. Showing more tickets barely helps</w:t>
       </w:r>
     </w:p>
     <w:p>
       <w:r>
-        <w:t>If we just count “shares a tag”, 67% of pulled tickets look relevant. That is misleading: removing the 6 generic tags drops it to 33%, and an AI reviewer reading the actual text puts it at 37%. A simple rule and an AI independently land in the same place — real relevance is about half the headline.</w:t>
+        <w:t>Showing 6, 8, or 10 past tickets. Average coverage climbs only 90% → 94% and full coverage 78% → 85% — small, diminishing gains for each extra ticket. So 6 examples is enough; more adds length without much benefit.</w:t>
       </w:r>
     </w:p>
     <w:p>
       <w:r>
         <w:drawing>
           <wp:inline xmlns:a="http://schemas.openxmlformats.org/drawingml/2006/main" xmlns:pic="http://schemas.openxmlformats.org/drawingml/2006/picture">
-            <wp:extent cx="5486400" cy="3520776"/>
+            <wp:extent cx="5486400" cy="3501715"/>
             <wp:docPr id="4" name="Picture 4"/>
             <wp:cNvGraphicFramePr>
               <a:graphicFrameLocks noChangeAspect="1"/>
@@ -236,7 +241,7 @@
               <a:graphicData uri="http://schemas.openxmlformats.org/drawingml/2006/picture">
                 <pic:pic>
                   <pic:nvPicPr>
-                    <pic:cNvPr id="0" name="precision_check.png"/>
+                    <pic:cNvPr id="0" name="tradeoff.png"/>
                     <pic:cNvPicPr/>
                   </pic:nvPicPr>
                   <pic:blipFill>
@@ -248,7 +253,7 @@
                   <pic:spPr>
                     <a:xfrm>
                       <a:off x="0" y="0"/>
-                      <a:ext cx="5486400" cy="3520776"/>
+                      <a:ext cx="5486400" cy="3501715"/>
                     </a:xfrm>
                     <a:prstGeom prst="rect"/>
                   </pic:spPr>
@@ -264,159 +269,12 @@
         <w:pStyle w:val="Heading1"/>
       </w:pPr>
       <w:r>
-        <w:t>5. Every example, sorted</w:t>
+        <w:t>5. The right answer is usually at the very top</w:t>
       </w:r>
     </w:p>
     <w:p>
       <w:r>
-        <w:t>Splitting all 3,729 pulled tickets four ways: only 24% are real matches (right tag AND same work), 39% are lucky matches (right tag, different work), 8% are the same work tagged differently, and 29% are unrelated. So 6 in 10 “matches” are coincidences.</w:t>
-      </w:r>
-    </w:p>
-    <w:p>
-      <w:r>
-        <w:drawing>
-          <wp:inline xmlns:a="http://schemas.openxmlformats.org/drawingml/2006/main" xmlns:pic="http://schemas.openxmlformats.org/drawingml/2006/picture">
-            <wp:extent cx="5486400" cy="3520776"/>
-            <wp:docPr id="5" name="Picture 5"/>
-            <wp:cNvGraphicFramePr>
-              <a:graphicFrameLocks noChangeAspect="1"/>
-            </wp:cNvGraphicFramePr>
-            <a:graphic>
-              <a:graphicData uri="http://schemas.openxmlformats.org/drawingml/2006/picture">
-                <pic:pic>
-                  <pic:nvPicPr>
-                    <pic:cNvPr id="0" name="crosstab.png"/>
-                    <pic:cNvPicPr/>
-                  </pic:nvPicPr>
-                  <pic:blipFill>
-                    <a:blip r:embed="rId13"/>
-                    <a:stretch>
-                      <a:fillRect/>
-                    </a:stretch>
-                  </pic:blipFill>
-                  <pic:spPr>
-                    <a:xfrm>
-                      <a:off x="0" y="0"/>
-                      <a:ext cx="5486400" cy="3520776"/>
-                    </a:xfrm>
-                    <a:prstGeom prst="rect"/>
-                  </pic:spPr>
-                </pic:pic>
-              </a:graphicData>
-            </a:graphic>
-          </wp:inline>
-        </w:drawing>
-      </w:r>
-    </w:p>
-    <w:p>
-      <w:pPr>
-        <w:pStyle w:val="Heading1"/>
-      </w:pPr>
-      <w:r>
-        <w:t>6. Why the lucky matches happen</w:t>
-      </w:r>
-    </w:p>
-    <w:p>
-      <w:r>
-        <w:t>Most pulled tickets are specific (a single tag). But a tail of “overloaded” tickets carry up to 19 tags each — those match almost any query by accident. Combined with 6 generic catch-all tags, they create the coincidental matches.</w:t>
-      </w:r>
-    </w:p>
-    <w:p>
-      <w:r>
-        <w:drawing>
-          <wp:inline xmlns:a="http://schemas.openxmlformats.org/drawingml/2006/main" xmlns:pic="http://schemas.openxmlformats.org/drawingml/2006/picture">
-            <wp:extent cx="5486400" cy="3476419"/>
-            <wp:docPr id="6" name="Picture 6"/>
-            <wp:cNvGraphicFramePr>
-              <a:graphicFrameLocks noChangeAspect="1"/>
-            </wp:cNvGraphicFramePr>
-            <a:graphic>
-              <a:graphicData uri="http://schemas.openxmlformats.org/drawingml/2006/picture">
-                <pic:pic>
-                  <pic:nvPicPr>
-                    <pic:cNvPr id="0" name="density.png"/>
-                    <pic:cNvPicPr/>
-                  </pic:nvPicPr>
-                  <pic:blipFill>
-                    <a:blip r:embed="rId14"/>
-                    <a:stretch>
-                      <a:fillRect/>
-                    </a:stretch>
-                  </pic:blipFill>
-                  <pic:spPr>
-                    <a:xfrm>
-                      <a:off x="0" y="0"/>
-                      <a:ext cx="5486400" cy="3476419"/>
-                    </a:xfrm>
-                    <a:prstGeom prst="rect"/>
-                  </pic:spPr>
-                </pic:pic>
-              </a:graphicData>
-            </a:graphic>
-          </wp:inline>
-        </w:drawing>
-      </w:r>
-    </w:p>
-    <w:p>
-      <w:pPr>
-        <w:pStyle w:val="Heading1"/>
-      </w:pPr>
-      <w:r>
-        <w:t>7. More examples is not better</w:t>
-      </w:r>
-    </w:p>
-    <w:p>
-      <w:r>
-        <w:t>Showing 6, 8, or 10 past tickets: more finds slightly more right answers but a steady share of the extras are junk — a near 1-for-1 trade. 6 is the sweet spot.</w:t>
-      </w:r>
-    </w:p>
-    <w:p>
-      <w:r>
-        <w:drawing>
-          <wp:inline xmlns:a="http://schemas.openxmlformats.org/drawingml/2006/main" xmlns:pic="http://schemas.openxmlformats.org/drawingml/2006/picture">
-            <wp:extent cx="5486400" cy="3549683"/>
-            <wp:docPr id="7" name="Picture 7"/>
-            <wp:cNvGraphicFramePr>
-              <a:graphicFrameLocks noChangeAspect="1"/>
-            </wp:cNvGraphicFramePr>
-            <a:graphic>
-              <a:graphicData uri="http://schemas.openxmlformats.org/drawingml/2006/picture">
-                <pic:pic>
-                  <pic:nvPicPr>
-                    <pic:cNvPr id="0" name="tradeoff.png"/>
-                    <pic:cNvPicPr/>
-                  </pic:nvPicPr>
-                  <pic:blipFill>
-                    <a:blip r:embed="rId15"/>
-                    <a:stretch>
-                      <a:fillRect/>
-                    </a:stretch>
-                  </pic:blipFill>
-                  <pic:spPr>
-                    <a:xfrm>
-                      <a:off x="0" y="0"/>
-                      <a:ext cx="5486400" cy="3549683"/>
-                    </a:xfrm>
-                    <a:prstGeom prst="rect"/>
-                  </pic:spPr>
-                </pic:pic>
-              </a:graphicData>
-            </a:graphic>
-          </wp:inline>
-        </w:drawing>
-      </w:r>
-    </w:p>
-    <w:p>
-      <w:pPr>
-        <w:pStyle w:val="Heading1"/>
-      </w:pPr>
-      <w:r>
-        <w:t>8. The first useful example is usually right at the top</w:t>
-      </w:r>
-    </w:p>
-    <w:p>
-      <w:r>
-        <w:t>For 288 of 373 tickets the #1 result is already useful; only 9 tickets found nothing relevant at all. The ranking puts good examples first — though the underlying scores barely separate good from bad (0.51 vs 0.48), so we rely on the ordering, not the score size.</w:t>
+        <w:t>For each ticket, the position of the first pulled ticket that carries a correct Value Stream. For 288 of 373 tickets it's position #1 — the top result is usually already right. Only 9 tickets found nothing correct at all. So the search not only finds the right streams, it ranks them first.</w:t>
       </w:r>
     </w:p>
     <w:p>
@@ -424,7 +282,7 @@
         <w:drawing>
           <wp:inline xmlns:a="http://schemas.openxmlformats.org/drawingml/2006/main" xmlns:pic="http://schemas.openxmlformats.org/drawingml/2006/picture">
             <wp:extent cx="5486400" cy="3523692"/>
-            <wp:docPr id="8" name="Picture 8"/>
+            <wp:docPr id="5" name="Picture 5"/>
             <wp:cNvGraphicFramePr>
               <a:graphicFrameLocks noChangeAspect="1"/>
             </wp:cNvGraphicFramePr>
@@ -436,7 +294,7 @@
                     <pic:cNvPicPr/>
                   </pic:nvPicPr>
                   <pic:blipFill>
-                    <a:blip r:embed="rId16"/>
+                    <a:blip r:embed="rId13"/>
                     <a:stretch>
                       <a:fillRect/>
                     </a:stretch>
@@ -524,7 +382,7 @@
           </w:tcPr>
           <w:p>
             <w:r>
-              <w:t>Right answer found (coverage)</w:t>
+              <w:t>Avg coverage (fraction of streams found)</w:t>
             </w:r>
           </w:p>
         </w:tc>
@@ -566,7 +424,7 @@
           </w:tcPr>
           <w:p>
             <w:r>
-              <w:t>Found at least one useful</w:t>
+              <w:t>Found at least one correct stream</w:t>
             </w:r>
           </w:p>
         </w:tc>
@@ -608,7 +466,7 @@
           </w:tcPr>
           <w:p>
             <w:r>
-              <w:t>Found EVERY stream</w:t>
+              <w:t>Found EVERY correct stream</w:t>
             </w:r>
           </w:p>
         </w:tc>
@@ -639,174 +497,6 @@
           <w:p>
             <w:r>
               <w:t>85%</w:t>
-            </w:r>
-          </w:p>
-        </w:tc>
-      </w:tr>
-      <w:tr>
-        <w:tc>
-          <w:tcPr>
-            <w:tcW w:type="dxa" w:w="2160"/>
-          </w:tcPr>
-          <w:p>
-            <w:r>
-              <w:t>Looks relevant</w:t>
-            </w:r>
-          </w:p>
-        </w:tc>
-        <w:tc>
-          <w:tcPr>
-            <w:tcW w:type="dxa" w:w="2160"/>
-          </w:tcPr>
-          <w:p>
-            <w:r>
-              <w:t>67%</w:t>
-            </w:r>
-          </w:p>
-        </w:tc>
-        <w:tc>
-          <w:tcPr>
-            <w:tcW w:type="dxa" w:w="2160"/>
-          </w:tcPr>
-          <w:p>
-            <w:r>
-              <w:t>65%</w:t>
-            </w:r>
-          </w:p>
-        </w:tc>
-        <w:tc>
-          <w:tcPr>
-            <w:tcW w:type="dxa" w:w="2160"/>
-          </w:tcPr>
-          <w:p>
-            <w:r>
-              <w:t>63%</w:t>
-            </w:r>
-          </w:p>
-        </w:tc>
-      </w:tr>
-      <w:tr>
-        <w:tc>
-          <w:tcPr>
-            <w:tcW w:type="dxa" w:w="2160"/>
-          </w:tcPr>
-          <w:p>
-            <w:r>
-              <w:t>Really relevant (minus generic)</w:t>
-            </w:r>
-          </w:p>
-        </w:tc>
-        <w:tc>
-          <w:tcPr>
-            <w:tcW w:type="dxa" w:w="2160"/>
-          </w:tcPr>
-          <w:p>
-            <w:r>
-              <w:t>33%</w:t>
-            </w:r>
-          </w:p>
-        </w:tc>
-        <w:tc>
-          <w:tcPr>
-            <w:tcW w:type="dxa" w:w="2160"/>
-          </w:tcPr>
-          <w:p>
-            <w:r>
-              <w:t>31%</w:t>
-            </w:r>
-          </w:p>
-        </w:tc>
-        <w:tc>
-          <w:tcPr>
-            <w:tcW w:type="dxa" w:w="2160"/>
-          </w:tcPr>
-          <w:p>
-            <w:r>
-              <w:t>30%</w:t>
-            </w:r>
-          </w:p>
-        </w:tc>
-      </w:tr>
-      <w:tr>
-        <w:tc>
-          <w:tcPr>
-            <w:tcW w:type="dxa" w:w="2160"/>
-          </w:tcPr>
-          <w:p>
-            <w:r>
-              <w:t>Really relevant (AI)</w:t>
-            </w:r>
-          </w:p>
-        </w:tc>
-        <w:tc>
-          <w:tcPr>
-            <w:tcW w:type="dxa" w:w="2160"/>
-          </w:tcPr>
-          <w:p>
-            <w:r>
-              <w:t>36%</w:t>
-            </w:r>
-          </w:p>
-        </w:tc>
-        <w:tc>
-          <w:tcPr>
-            <w:tcW w:type="dxa" w:w="2160"/>
-          </w:tcPr>
-          <w:p>
-            <w:r>
-              <w:t>34%</w:t>
-            </w:r>
-          </w:p>
-        </w:tc>
-        <w:tc>
-          <w:tcPr>
-            <w:tcW w:type="dxa" w:w="2160"/>
-          </w:tcPr>
-          <w:p>
-            <w:r>
-              <w:t>32%</w:t>
-            </w:r>
-          </w:p>
-        </w:tc>
-      </w:tr>
-      <w:tr>
-        <w:tc>
-          <w:tcPr>
-            <w:tcW w:type="dxa" w:w="2160"/>
-          </w:tcPr>
-          <w:p>
-            <w:r>
-              <w:t>First useful at the top (MRR)</w:t>
-            </w:r>
-          </w:p>
-        </w:tc>
-        <w:tc>
-          <w:tcPr>
-            <w:tcW w:type="dxa" w:w="2160"/>
-          </w:tcPr>
-          <w:p>
-            <w:r>
-              <w:t>0.85</w:t>
-            </w:r>
-          </w:p>
-        </w:tc>
-        <w:tc>
-          <w:tcPr>
-            <w:tcW w:type="dxa" w:w="2160"/>
-          </w:tcPr>
-          <w:p>
-            <w:r>
-              <w:t>0.85</w:t>
-            </w:r>
-          </w:p>
-        </w:tc>
-        <w:tc>
-          <w:tcPr>
-            <w:tcW w:type="dxa" w:w="2160"/>
-          </w:tcPr>
-          <w:p>
-            <w:r>
-              <w:t>0.85</w:t>
             </w:r>
           </w:p>
         </w:tc>
@@ -859,7 +549,7 @@
           </w:tcPr>
           <w:p>
             <w:r>
-              <w:t>Value Stream / tag</w:t>
+              <w:t>Value Stream</w:t>
             </w:r>
           </w:p>
         </w:tc>
@@ -891,7 +581,7 @@
           </w:tcPr>
           <w:p>
             <w:r>
-              <w:t>Did the correct Value Stream show up among the pulled examples.</w:t>
+              <w:t>Of a ticket's correct Value Streams, how many showed up in the pulled examples.</w:t>
             </w:r>
           </w:p>
         </w:tc>
@@ -903,7 +593,7 @@
           </w:tcPr>
           <w:p>
             <w:r>
-              <w:t>Looks relevant</w:t>
+              <w:t>Found everything</w:t>
             </w:r>
           </w:p>
         </w:tc>
@@ -913,95 +603,7 @@
           </w:tcPr>
           <w:p>
             <w:r>
-              <w:t>An example that shares a tag with the current ticket.</w:t>
-            </w:r>
-          </w:p>
-        </w:tc>
-      </w:tr>
-      <w:tr>
-        <w:tc>
-          <w:tcPr>
-            <w:tcW w:type="dxa" w:w="4320"/>
-          </w:tcPr>
-          <w:p>
-            <w:r>
-              <w:t>Really relevant</w:t>
-            </w:r>
-          </w:p>
-        </w:tc>
-        <w:tc>
-          <w:tcPr>
-            <w:tcW w:type="dxa" w:w="4320"/>
-          </w:tcPr>
-          <w:p>
-            <w:r>
-              <w:t>An example that's actually about the same kind of work, not just a shared tag.</w:t>
-            </w:r>
-          </w:p>
-        </w:tc>
-      </w:tr>
-      <w:tr>
-        <w:tc>
-          <w:tcPr>
-            <w:tcW w:type="dxa" w:w="4320"/>
-          </w:tcPr>
-          <w:p>
-            <w:r>
-              <w:t>Lucky match</w:t>
-            </w:r>
-          </w:p>
-        </w:tc>
-        <w:tc>
-          <w:tcPr>
-            <w:tcW w:type="dxa" w:w="4320"/>
-          </w:tcPr>
-          <w:p>
-            <w:r>
-              <w:t>Shares a tag by coincidence (usually a generic tag) but is different work.</w:t>
-            </w:r>
-          </w:p>
-        </w:tc>
-      </w:tr>
-      <w:tr>
-        <w:tc>
-          <w:tcPr>
-            <w:tcW w:type="dxa" w:w="4320"/>
-          </w:tcPr>
-          <w:p>
-            <w:r>
-              <w:t>Generic / catch-all tag</w:t>
-            </w:r>
-          </w:p>
-        </w:tc>
-        <w:tc>
-          <w:tcPr>
-            <w:tcW w:type="dxa" w:w="4320"/>
-          </w:tcPr>
-          <w:p>
-            <w:r>
-              <w:t>A Value Stream on a large share of tickets, so sharing it means little.</w:t>
-            </w:r>
-          </w:p>
-        </w:tc>
-      </w:tr>
-      <w:tr>
-        <w:tc>
-          <w:tcPr>
-            <w:tcW w:type="dxa" w:w="4320"/>
-          </w:tcPr>
-          <w:p>
-            <w:r>
-              <w:t>Overloaded ticket</w:t>
-            </w:r>
-          </w:p>
-        </w:tc>
-        <w:tc>
-          <w:tcPr>
-            <w:tcW w:type="dxa" w:w="4320"/>
-          </w:tcPr>
-          <w:p>
-            <w:r>
-              <w:t>A past ticket tagged with many Value Streams — matches almost anything.</w:t>
+              <w:t>All of a ticket's correct Value Streams were found — none missed.</w:t>
             </w:r>
           </w:p>
         </w:tc>
@@ -1024,6 +626,28 @@
           <w:p>
             <w:r>
               <w:t>Easy = 1 correct Value Stream; hard = 2 or more.</w:t>
+            </w:r>
+          </w:p>
+        </w:tc>
+      </w:tr>
+      <w:tr>
+        <w:tc>
+          <w:tcPr>
+            <w:tcW w:type="dxa" w:w="4320"/>
+          </w:tcPr>
+          <w:p>
+            <w:r>
+              <w:t>@6 / @8 / @10</w:t>
+            </w:r>
+          </w:p>
+        </w:tc>
+        <w:tc>
+          <w:tcPr>
+            <w:tcW w:type="dxa" w:w="4320"/>
+          </w:tcPr>
+          <w:p>
+            <w:r>
+              <w:t>When showing the top 6 / 8 / 10 pulled past tickets.</w:t>
             </w:r>
           </w:p>
         </w:tc>

</xml_diff>

<commit_message>
Retrieval report: add the average-count view (~2.9 of 3.2 streams found)
Pair the ticket-count stats (78% found all) with the per-ticket average: a typical
ticket has 3.2 correct Value Streams and the search finds ~2.9 of them (90%). MD + docx.

Co-Authored-By: Claude Opus 4.8 <noreply@anthropic.com>
</commit_message>
<xml_diff>
--- a/docs/retrieval_report.docx
+++ b/docs/retrieval_report.docx
@@ -37,6 +37,14 @@
       </w:pPr>
       <w:r>
         <w:t>78% of tickets find EVERY one of their correct Value Streams; 18% find some but miss a few; only 4% find none.</w:t>
+      </w:r>
+    </w:p>
+    <w:p>
+      <w:pPr>
+        <w:pStyle w:val="ListBullet"/>
+      </w:pPr>
+      <w:r>
+        <w:t>On average a ticket has 3.2 correct Value Streams and the search finds ~2.9 of them (90%).</w:t>
       </w:r>
     </w:p>
     <w:p>

</xml_diff>

<commit_message>
Retrieval report: add plain-count framing to each chart's explanation
Add the 'how many streams' counts alongside the percentages: hard tickets average
~5.6 correct VS, find ~4.9 (88%), complete set 63% (~113 of 180); easy ~178 of 193;
K diminishing returns ~2.9->3.0 streams; first-rank 288 of 373 (77%) at position 1.
MD + docx.

Co-Authored-By: Claude Opus 4.8 <noreply@anthropic.com>
</commit_message>
<xml_diff>
--- a/docs/retrieval_report.docx
+++ b/docs/retrieval_report.docx
@@ -184,7 +184,12 @@
     </w:p>
     <w:p>
       <w:r>
-        <w:t>Two ticket groups (easy = 1 stream, hard = 2+), each measured two ways. BLUE 'found most' is the average fraction of a ticket's streams found — easy 92%, hard 88% (nearly the same, so we find most of the answer even on hard tickets). GREEN 'found every' is how often ALL streams were found — easy 92%, hard only 63%. For easy tickets the two bars match (one stream, so 'most' and 'every' are the same). For hard tickets the gap (88% vs 63%) is the story: we usually catch the obvious streams but miss one or two from the long tail.</w:t>
+        <w:t>Two ticket groups (easy = 1 stream, 193 tickets; hard = 2+, 180 tickets), each measured two ways. BLUE 'found most' is the average fraction of a ticket's streams found — easy 92%, hard 88%. GREEN 'found every' is how often ALL streams were found — easy 92%, hard only 63%.</w:t>
+      </w:r>
+    </w:p>
+    <w:p>
+      <w:r>
+        <w:t>In plain counts: an easy ticket has 1 stream, found 92% of the time (~178 of 193). A hard ticket has ~5.6 correct Value Streams on average — the search finds ~4.9 of them (88%) but lands the complete set only 63% of the time (~113 of 180). So on a hard ticket we usually catch ~4.9 of ~5.6 streams but miss one or two from the long tail.</w:t>
       </w:r>
     </w:p>
     <w:p>

</xml_diff>

<commit_message>
Coverage section: show each group's avg coverage (Found SOME = ~68%)
Add a small table under the coverage chart: Found ALL 78% (100% of their streams),
Found SOME 18% (~68% = ~2 of 3), Found NONE 4% (0%) - so the 'partial' tickets aren't
finding a sliver, they get ~two-thirds and miss the long-tail third. Derived exactly
from overall 90% = 78%x100 + 18%xP + 4%x0. MD + docx.

Co-Authored-By: Claude Opus 4.8 <noreply@anthropic.com>
</commit_message>
<xml_diff>
--- a/docs/retrieval_report.docx
+++ b/docs/retrieval_report.docx
@@ -125,6 +125,151 @@
         </w:drawing>
       </w:r>
     </w:p>
+    <w:p>
+      <w:r>
+        <w:t>How complete is each group? Even the 'found some' group finds about two-thirds of their streams on average:</w:t>
+      </w:r>
+    </w:p>
+    <w:tbl>
+      <w:tblPr>
+        <w:tblStyle w:val="LightGrid-Accent1"/>
+        <w:tblW w:type="auto" w:w="0"/>
+        <w:tblLook w:firstColumn="1" w:firstRow="1" w:lastColumn="0" w:lastRow="0" w:noHBand="0" w:noVBand="1" w:val="04A0"/>
+      </w:tblPr>
+      <w:tblGrid>
+        <w:gridCol w:w="2880"/>
+        <w:gridCol w:w="2880"/>
+        <w:gridCol w:w="2880"/>
+      </w:tblGrid>
+      <w:tr>
+        <w:tc>
+          <w:tcPr>
+            <w:tcW w:type="dxa" w:w="2880"/>
+          </w:tcPr>
+          <w:p>
+            <w:r>
+              <w:t>Group</w:t>
+            </w:r>
+          </w:p>
+        </w:tc>
+        <w:tc>
+          <w:tcPr>
+            <w:tcW w:type="dxa" w:w="2880"/>
+          </w:tcPr>
+          <w:p>
+            <w:r>
+              <w:t>% of tickets</w:t>
+            </w:r>
+          </w:p>
+        </w:tc>
+        <w:tc>
+          <w:tcPr>
+            <w:tcW w:type="dxa" w:w="2880"/>
+          </w:tcPr>
+          <w:p>
+            <w:r>
+              <w:t>Of their streams, found (avg)</w:t>
+            </w:r>
+          </w:p>
+        </w:tc>
+      </w:tr>
+      <w:tr>
+        <w:tc>
+          <w:tcPr>
+            <w:tcW w:type="dxa" w:w="2880"/>
+          </w:tcPr>
+          <w:p>
+            <w:r>
+              <w:t>Found ALL</w:t>
+            </w:r>
+          </w:p>
+        </w:tc>
+        <w:tc>
+          <w:tcPr>
+            <w:tcW w:type="dxa" w:w="2880"/>
+          </w:tcPr>
+          <w:p>
+            <w:r>
+              <w:t>78%</w:t>
+            </w:r>
+          </w:p>
+        </w:tc>
+        <w:tc>
+          <w:tcPr>
+            <w:tcW w:type="dxa" w:w="2880"/>
+          </w:tcPr>
+          <w:p>
+            <w:r>
+              <w:t>100%</w:t>
+            </w:r>
+          </w:p>
+        </w:tc>
+      </w:tr>
+      <w:tr>
+        <w:tc>
+          <w:tcPr>
+            <w:tcW w:type="dxa" w:w="2880"/>
+          </w:tcPr>
+          <w:p>
+            <w:r>
+              <w:t>Found SOME</w:t>
+            </w:r>
+          </w:p>
+        </w:tc>
+        <w:tc>
+          <w:tcPr>
+            <w:tcW w:type="dxa" w:w="2880"/>
+          </w:tcPr>
+          <w:p>
+            <w:r>
+              <w:t>18%</w:t>
+            </w:r>
+          </w:p>
+        </w:tc>
+        <w:tc>
+          <w:tcPr>
+            <w:tcW w:type="dxa" w:w="2880"/>
+          </w:tcPr>
+          <w:p>
+            <w:r>
+              <w:t>~68% (≈2 of 3)</w:t>
+            </w:r>
+          </w:p>
+        </w:tc>
+      </w:tr>
+      <w:tr>
+        <w:tc>
+          <w:tcPr>
+            <w:tcW w:type="dxa" w:w="2880"/>
+          </w:tcPr>
+          <w:p>
+            <w:r>
+              <w:t>Found NONE</w:t>
+            </w:r>
+          </w:p>
+        </w:tc>
+        <w:tc>
+          <w:tcPr>
+            <w:tcW w:type="dxa" w:w="2880"/>
+          </w:tcPr>
+          <w:p>
+            <w:r>
+              <w:t>4%</w:t>
+            </w:r>
+          </w:p>
+        </w:tc>
+        <w:tc>
+          <w:tcPr>
+            <w:tcW w:type="dxa" w:w="2880"/>
+          </w:tcPr>
+          <w:p>
+            <w:r>
+              <w:t>0%</w:t>
+            </w:r>
+          </w:p>
+        </w:tc>
+      </w:tr>
+    </w:tbl>
     <w:p>
       <w:pPr>
         <w:pStyle w:val="Heading1"/>

</xml_diff>

<commit_message>
Add explicit count row: ~2.9 of ~3.2 correct streams surfaced per ticket
The numbers table was all percentages; add the count view - avg correct Value Streams
the historic search surfaces per ticket (~2.9 / ~3.0 / ~3.0 at K=6/8/10). MD + docx.

Co-Authored-By: Claude Opus 4.8 <noreply@anthropic.com>
</commit_message>
<xml_diff>
--- a/docs/retrieval_report.docx
+++ b/docs/retrieval_report.docx
@@ -540,6 +540,48 @@
           </w:tcPr>
           <w:p>
             <w:r>
+              <w:t>Streams found per ticket (of ~3.2 correct)</w:t>
+            </w:r>
+          </w:p>
+        </w:tc>
+        <w:tc>
+          <w:tcPr>
+            <w:tcW w:type="dxa" w:w="2160"/>
+          </w:tcPr>
+          <w:p>
+            <w:r>
+              <w:t>~2.9</w:t>
+            </w:r>
+          </w:p>
+        </w:tc>
+        <w:tc>
+          <w:tcPr>
+            <w:tcW w:type="dxa" w:w="2160"/>
+          </w:tcPr>
+          <w:p>
+            <w:r>
+              <w:t>~3.0</w:t>
+            </w:r>
+          </w:p>
+        </w:tc>
+        <w:tc>
+          <w:tcPr>
+            <w:tcW w:type="dxa" w:w="2160"/>
+          </w:tcPr>
+          <w:p>
+            <w:r>
+              <w:t>~3.0</w:t>
+            </w:r>
+          </w:p>
+        </w:tc>
+      </w:tr>
+      <w:tr>
+        <w:tc>
+          <w:tcPr>
+            <w:tcW w:type="dxa" w:w="2160"/>
+          </w:tcPr>
+          <w:p>
+            <w:r>
               <w:t>Avg coverage (fraction of streams found)</w:t>
             </w:r>
           </w:p>

</xml_diff>

<commit_message>
Streams-found count: show 2.90->2.97->3.03 (real progression, not rounded ~3.0)
The rounded ~2.9/~3.0/~3.0 hid that 2.97 and 3.03 differ; show 2 decimals so the
real progression reads honestly and reinforces diminishing returns (+0.13 stream
across 4 extra tickets). MD + docx.

Co-Authored-By: Claude Opus 4.8 <noreply@anthropic.com>
</commit_message>
<xml_diff>
--- a/docs/retrieval_report.docx
+++ b/docs/retrieval_report.docx
@@ -550,7 +550,7 @@
           </w:tcPr>
           <w:p>
             <w:r>
-              <w:t>~2.9</w:t>
+              <w:t>2.90</w:t>
             </w:r>
           </w:p>
         </w:tc>
@@ -560,7 +560,7 @@
           </w:tcPr>
           <w:p>
             <w:r>
-              <w:t>~3.0</w:t>
+              <w:t>2.97</w:t>
             </w:r>
           </w:p>
         </w:tc>
@@ -570,7 +570,7 @@
           </w:tcPr>
           <w:p>
             <w:r>
-              <w:t>~3.0</w:t>
+              <w:t>3.03</w:t>
             </w:r>
           </w:p>
         </w:tc>

</xml_diff>